<commit_message>
chore: rebuild resume.docx from resume.json
</commit_message>
<xml_diff>
--- a/resume.docx
+++ b/resume.docx
@@ -23,7 +23,7 @@
         <w:spacing w:after="140" w:before="0"/>
         <w:jc w:val="center"/>
       </w:pPr>
-      <w:hyperlink w:history="1" r:id="rIdlvbepkub1kmefwfgggbwz">
+      <w:hyperlink w:history="1" r:id="rIduqa4ivw1sqgomx_fbn2ss">
         <w:r>
           <w:rPr>
             <w:rFonts w:ascii="Garamond" w:cs="Garamond" w:eastAsia="Garamond" w:hAnsi="Garamond"/>
@@ -757,6 +757,148 @@
           <w:sz w:val="22"/>
           <w:szCs w:val="22"/>
         </w:rPr>
+        <w:t xml:space="preserve">Twitch Bot Microservices</w:t>
+      </w:r>
+      <w:r>
+        <w:rPr>
+          <w:rFonts w:ascii="Garamond" w:cs="Garamond" w:eastAsia="Garamond" w:hAnsi="Garamond"/>
+          <w:sz w:val="19"/>
+          <w:szCs w:val="19"/>
+        </w:rPr>
+        <w:t xml:space="preserve"> </w:t>
+      </w:r>
+      <w:hyperlink w:history="1" r:id="rIdfed4fwao_wtdxkxlyw26r">
+        <w:r>
+          <w:rPr>
+            <w:rFonts w:ascii="Garamond" w:cs="Garamond" w:eastAsia="Garamond" w:hAnsi="Garamond"/>
+            <w:color w:val="000000"/>
+            <w:sz w:val="18"/>
+            <w:szCs w:val="18"/>
+          </w:rPr>
+          <w:t xml:space="preserve">https://github.com/Heros-Tempus/My-Twitch-Bot</w:t>
+        </w:r>
+      </w:hyperlink>
+    </w:p>
+    <w:p>
+      <w:pPr>
+        <w:pStyle w:val="ListParagraph"/>
+        <w:numPr>
+          <w:ilvl w:val="0"/>
+          <w:numId w:val="2"/>
+        </w:numPr>
+        <w:spacing w:after="20" w:before="0"/>
+      </w:pPr>
+      <w:r>
+        <w:rPr>
+          <w:rFonts w:ascii="Garamond" w:cs="Garamond" w:eastAsia="Garamond" w:hAnsi="Garamond"/>
+          <w:sz w:val="19"/>
+          <w:szCs w:val="19"/>
+        </w:rPr>
+        <w:t xml:space="preserve">Architected a distributed, locally-hosted Twitch bot composed of specialized microservices in Go communicating via a central RabbitMQ message broker.</w:t>
+      </w:r>
+    </w:p>
+    <w:p>
+      <w:pPr>
+        <w:pStyle w:val="ListParagraph"/>
+        <w:numPr>
+          <w:ilvl w:val="0"/>
+          <w:numId w:val="2"/>
+        </w:numPr>
+        <w:spacing w:after="20" w:before="0"/>
+      </w:pPr>
+      <w:r>
+        <w:rPr>
+          <w:rFonts w:ascii="Garamond" w:cs="Garamond" w:eastAsia="Garamond" w:hAnsi="Garamond"/>
+          <w:sz w:val="19"/>
+          <w:szCs w:val="19"/>
+        </w:rPr>
+        <w:t xml:space="preserve">Built a resilient EventSub WebSocket listener for real-time chat routing, proactively managing OAuth tokens and persisting state in a PostgreSQL database.</w:t>
+      </w:r>
+    </w:p>
+    <w:p>
+      <w:pPr>
+        <w:pStyle w:val="ListParagraph"/>
+        <w:numPr>
+          <w:ilvl w:val="0"/>
+          <w:numId w:val="2"/>
+        </w:numPr>
+        <w:spacing w:after="20" w:before="0"/>
+      </w:pPr>
+      <w:r>
+        <w:rPr>
+          <w:rFonts w:ascii="Garamond" w:cs="Garamond" w:eastAsia="Garamond" w:hAnsi="Garamond"/>
+          <w:sz w:val="19"/>
+          <w:szCs w:val="19"/>
+        </w:rPr>
+        <w:t xml:space="preserve">Developed embedded local web servers to render dynamic HTML/CSS chat overlays and manage a YouTube media player queue.</w:t>
+      </w:r>
+    </w:p>
+    <w:p>
+      <w:pPr>
+        <w:pStyle w:val="ListParagraph"/>
+        <w:numPr>
+          <w:ilvl w:val="0"/>
+          <w:numId w:val="2"/>
+        </w:numPr>
+        <w:spacing w:after="20" w:before="0"/>
+      </w:pPr>
+      <w:r>
+        <w:rPr>
+          <w:rFonts w:ascii="Garamond" w:cs="Garamond" w:eastAsia="Garamond" w:hAnsi="Garamond"/>
+          <w:sz w:val="19"/>
+          <w:szCs w:val="19"/>
+        </w:rPr>
+        <w:t xml:space="preserve">Interfaced directly with OBS Studio via WebSockets to automate scene item visibility and trigger audio ducking filters during media playback.</w:t>
+      </w:r>
+    </w:p>
+    <w:p>
+      <w:pPr>
+        <w:pStyle w:val="ListParagraph"/>
+        <w:numPr>
+          <w:ilvl w:val="0"/>
+          <w:numId w:val="2"/>
+        </w:numPr>
+        <w:spacing w:after="20" w:before="0"/>
+      </w:pPr>
+      <w:r>
+        <w:rPr>
+          <w:rFonts w:ascii="Garamond" w:cs="Garamond" w:eastAsia="Garamond" w:hAnsi="Garamond"/>
+          <w:sz w:val="19"/>
+          <w:szCs w:val="19"/>
+        </w:rPr>
+        <w:t xml:space="preserve">Containerized the infrastructure using multi-stage Docker builds and orchestrated deployment via Docker Compose.</w:t>
+      </w:r>
+    </w:p>
+    <w:p>
+      <w:pPr>
+        <w:pStyle w:val="ListParagraph"/>
+        <w:numPr>
+          <w:ilvl w:val="0"/>
+          <w:numId w:val="2"/>
+        </w:numPr>
+        <w:spacing w:after="100" w:before="0"/>
+      </w:pPr>
+      <w:r>
+        <w:rPr>
+          <w:rFonts w:ascii="Garamond" w:cs="Garamond" w:eastAsia="Garamond" w:hAnsi="Garamond"/>
+          <w:sz w:val="19"/>
+          <w:szCs w:val="19"/>
+        </w:rPr>
+        <w:t xml:space="preserve">Stack: Go, RabbitMQ, PostgreSQL, Docker, Microservices, WebSockets</w:t>
+      </w:r>
+    </w:p>
+    <w:p>
+      <w:pPr>
+        <w:spacing w:after="30" w:before="140"/>
+      </w:pPr>
+      <w:r>
+        <w:rPr>
+          <w:rFonts w:ascii="Garamond" w:cs="Garamond" w:eastAsia="Garamond" w:hAnsi="Garamond"/>
+          <w:b/>
+          <w:bCs/>
+          <w:sz w:val="22"/>
+          <w:szCs w:val="22"/>
+        </w:rPr>
         <w:t xml:space="preserve">Gator</w:t>
       </w:r>
       <w:r>
@@ -767,7 +909,7 @@
         </w:rPr>
         <w:t xml:space="preserve"> </w:t>
       </w:r>
-      <w:hyperlink w:history="1" r:id="rId8uuq2y-po5fgaj-ixqfef">
+      <w:hyperlink w:history="1" r:id="rId2vamnawsweuggoqu83czr">
         <w:r>
           <w:rPr>
             <w:rFonts w:ascii="Garamond" w:cs="Garamond" w:eastAsia="Garamond" w:hAnsi="Garamond"/>
@@ -855,7 +997,7 @@
         </w:rPr>
         <w:t xml:space="preserve"> </w:t>
       </w:r>
-      <w:hyperlink w:history="1" r:id="rIdiugjlad3vcsklnh0ztozy">
+      <w:hyperlink w:history="1" r:id="rIdt_j4ti7fm4wa9w4xmb3vp">
         <w:r>
           <w:rPr>
             <w:rFonts w:ascii="Garamond" w:cs="Garamond" w:eastAsia="Garamond" w:hAnsi="Garamond"/>
@@ -961,7 +1103,7 @@
         </w:rPr>
         <w:t xml:space="preserve"> </w:t>
       </w:r>
-      <w:hyperlink w:history="1" r:id="rIddaimcfze3kutpj6ni7i4a">
+      <w:hyperlink w:history="1" r:id="rIdvxabdwu2toppoi82ydu-4">
         <w:r>
           <w:rPr>
             <w:rFonts w:ascii="Garamond" w:cs="Garamond" w:eastAsia="Garamond" w:hAnsi="Garamond"/>
@@ -1067,7 +1209,7 @@
         </w:rPr>
         <w:t xml:space="preserve"> </w:t>
       </w:r>
-      <w:hyperlink w:history="1" r:id="rId8owwjmhkojiclkijmvny1">
+      <w:hyperlink w:history="1" r:id="rIdnkvw0cytu49qill1bmxtn">
         <w:r>
           <w:rPr>
             <w:rFonts w:ascii="Garamond" w:cs="Garamond" w:eastAsia="Garamond" w:hAnsi="Garamond"/>
@@ -1155,7 +1297,7 @@
         </w:rPr>
         <w:t xml:space="preserve"> </w:t>
       </w:r>
-      <w:hyperlink w:history="1" r:id="rId3wp9pioldzbijewvvlibh">
+      <w:hyperlink w:history="1" r:id="rIdyoznpx8ff6a5brduh4v5s">
         <w:r>
           <w:rPr>
             <w:rFonts w:ascii="Garamond" w:cs="Garamond" w:eastAsia="Garamond" w:hAnsi="Garamond"/>
@@ -1279,7 +1421,7 @@
         </w:rPr>
         <w:t xml:space="preserve"> </w:t>
       </w:r>
-      <w:hyperlink w:history="1" r:id="rId06qjyuuh2wgkl--gnqabu">
+      <w:hyperlink w:history="1" r:id="rIdv38v5l---ckthbnkcyoox">
         <w:r>
           <w:rPr>
             <w:rFonts w:ascii="Garamond" w:cs="Garamond" w:eastAsia="Garamond" w:hAnsi="Garamond"/>
@@ -1384,7 +1526,7 @@
         </w:rPr>
         <w:t xml:space="preserve"> </w:t>
       </w:r>
-      <w:hyperlink w:history="1" r:id="rIdm7wj8stjrb4jfmdv82os4">
+      <w:hyperlink w:history="1" r:id="rIdhkm8-xncunjds-etaozbq">
         <w:r>
           <w:rPr>
             <w:rFonts w:ascii="Garamond" w:cs="Garamond" w:eastAsia="Garamond" w:hAnsi="Garamond"/>
@@ -1454,7 +1596,7 @@
         </w:rPr>
         <w:t xml:space="preserve"> </w:t>
       </w:r>
-      <w:hyperlink w:history="1" r:id="rIdi_yyqv29qudn0vexd-wds">
+      <w:hyperlink w:history="1" r:id="rIdr83mimced4bh_xsbwogbv">
         <w:r>
           <w:rPr>
             <w:rFonts w:ascii="Garamond" w:cs="Garamond" w:eastAsia="Garamond" w:hAnsi="Garamond"/>
@@ -1524,7 +1666,7 @@
         </w:rPr>
         <w:t xml:space="preserve"> </w:t>
       </w:r>
-      <w:hyperlink w:history="1" r:id="rIdmkk7za0fckicz2gsxvo_s">
+      <w:hyperlink w:history="1" r:id="rIdqyztdam7roimdu07mbyak">
         <w:r>
           <w:rPr>
             <w:rFonts w:ascii="Garamond" w:cs="Garamond" w:eastAsia="Garamond" w:hAnsi="Garamond"/>
@@ -1594,7 +1736,7 @@
         </w:rPr>
         <w:t xml:space="preserve"> </w:t>
       </w:r>
-      <w:hyperlink w:history="1" r:id="rIdsetituuzp_g8fdwvbpryi">
+      <w:hyperlink w:history="1" r:id="rIdorn0ctjlnsvleycxi-z0s">
         <w:r>
           <w:rPr>
             <w:rFonts w:ascii="Garamond" w:cs="Garamond" w:eastAsia="Garamond" w:hAnsi="Garamond"/>
@@ -1664,7 +1806,7 @@
         </w:rPr>
         <w:t xml:space="preserve"> </w:t>
       </w:r>
-      <w:hyperlink w:history="1" r:id="rIdwnoo_mfsqgr8f5pxvqpoc">
+      <w:hyperlink w:history="1" r:id="rIdsjxokhgsqcidlkkbpkt28">
         <w:r>
           <w:rPr>
             <w:rFonts w:ascii="Garamond" w:cs="Garamond" w:eastAsia="Garamond" w:hAnsi="Garamond"/>
@@ -1734,7 +1876,7 @@
         </w:rPr>
         <w:t xml:space="preserve"> </w:t>
       </w:r>
-      <w:hyperlink w:history="1" r:id="rIddojl6oidwbwl56tzwyead">
+      <w:hyperlink w:history="1" r:id="rIdofvwwc5tvqxp_pdavsxqh">
         <w:r>
           <w:rPr>
             <w:rFonts w:ascii="Garamond" w:cs="Garamond" w:eastAsia="Garamond" w:hAnsi="Garamond"/>
@@ -1804,7 +1946,7 @@
         </w:rPr>
         <w:t xml:space="preserve"> </w:t>
       </w:r>
-      <w:hyperlink w:history="1" r:id="rIddsft6jopzqp6kweavsnoh">
+      <w:hyperlink w:history="1" r:id="rIdzjhkxy2tlcqwtb5d5hidq">
         <w:r>
           <w:rPr>
             <w:rFonts w:ascii="Garamond" w:cs="Garamond" w:eastAsia="Garamond" w:hAnsi="Garamond"/>

</xml_diff>